<commit_message>
Added concept ideas about poule algorithm
</commit_message>
<xml_diff>
--- a/Docs/Project_LOG.docx
+++ b/Docs/Project_LOG.docx
@@ -6,13 +6,8 @@
       <w:pPr>
         <w:jc w:val="center"/>
       </w:pPr>
-      <w:proofErr w:type="spellStart"/>
       <w:r>
-        <w:t>Champions</w:t>
-      </w:r>
-      <w:proofErr w:type="spellEnd"/>
-      <w:r>
-        <w:t xml:space="preserve"> league model:</w:t>
+        <w:t>Champions league model:</w:t>
       </w:r>
     </w:p>
     <w:p>
@@ -41,23 +36,7 @@
         </w:numPr>
       </w:pPr>
       <w:r>
-        <w:t xml:space="preserve">Maak functie die </w:t>
-      </w:r>
-      <w:proofErr w:type="spellStart"/>
-      <w:r>
-        <w:t>lambda</w:t>
-      </w:r>
-      <w:proofErr w:type="spellEnd"/>
-      <w:r>
-        <w:t xml:space="preserve"> berekent (</w:t>
-      </w:r>
-      <w:proofErr w:type="spellStart"/>
-      <w:r>
-        <w:t>evt</w:t>
-      </w:r>
-      <w:proofErr w:type="spellEnd"/>
-      <w:r>
-        <w:t xml:space="preserve"> onderscheid in thuis/uit)</w:t>
+        <w:t>Maak functie die lambda berekent (evt onderscheid in thuis/uit)</w:t>
       </w:r>
     </w:p>
     <w:p>
@@ -120,13 +99,8 @@
           <w:numId w:val="11"/>
         </w:numPr>
       </w:pPr>
-      <w:proofErr w:type="spellStart"/>
       <w:r>
-        <w:t>Chatgpt</w:t>
-      </w:r>
-      <w:proofErr w:type="spellEnd"/>
-      <w:r>
-        <w:t xml:space="preserve"> gebruikt voor importeren data naar python</w:t>
+        <w:t>Chatgpt gebruikt voor importeren data naar python</w:t>
       </w:r>
       <w:r>
         <w:t>, en opschonen data.</w:t>
@@ -186,15 +160,7 @@
         <w:t>Data opschonen ging via</w:t>
       </w:r>
       <w:r>
-        <w:t xml:space="preserve"> informatie opvragen via code over allerlei rijen en kolommen. </w:t>
-      </w:r>
-      <w:proofErr w:type="spellStart"/>
-      <w:r>
-        <w:t>Bijv</w:t>
-      </w:r>
-      <w:proofErr w:type="spellEnd"/>
-      <w:r>
-        <w:t xml:space="preserve"> missing data etc. </w:t>
+        <w:t xml:space="preserve"> informatie opvragen via code over allerlei rijen en kolommen. Bijv missing data etc. </w:t>
       </w:r>
     </w:p>
     <w:p/>
@@ -211,21 +177,8 @@
           <w:numId w:val="11"/>
         </w:numPr>
       </w:pPr>
-      <w:proofErr w:type="spellStart"/>
       <w:r>
-        <w:t>Chatgpt</w:t>
-      </w:r>
-      <w:proofErr w:type="spellEnd"/>
-      <w:r>
-        <w:t xml:space="preserve"> gebruikt voor uploaden </w:t>
-      </w:r>
-      <w:proofErr w:type="spellStart"/>
-      <w:r>
-        <w:t>github</w:t>
-      </w:r>
-      <w:proofErr w:type="spellEnd"/>
-      <w:r>
-        <w:t xml:space="preserve">. </w:t>
+        <w:t xml:space="preserve">Chatgpt gebruikt voor uploaden github. </w:t>
       </w:r>
     </w:p>
     <w:p>
@@ -237,15 +190,7 @@
         </w:numPr>
       </w:pPr>
       <w:r>
-        <w:t xml:space="preserve">Belangrijke volgorde voor changes op </w:t>
-      </w:r>
-      <w:proofErr w:type="spellStart"/>
-      <w:r>
-        <w:t>github</w:t>
-      </w:r>
-      <w:proofErr w:type="spellEnd"/>
-      <w:r>
-        <w:t>:</w:t>
+        <w:t>Belangrijke volgorde voor changes op github:</w:t>
       </w:r>
     </w:p>
     <w:p>
@@ -257,6 +202,71 @@
         </w:numPr>
       </w:pPr>
       <w:r>
+        <w:drawing>
+          <wp:anchor distT="0" distB="0" distL="114300" distR="114300" simplePos="0" relativeHeight="251658240" behindDoc="0" locked="0" layoutInCell="1" allowOverlap="1" wp14:anchorId="61FED38F" wp14:editId="13B07129">
+            <wp:simplePos x="0" y="0"/>
+            <wp:positionH relativeFrom="page">
+              <wp:align>right</wp:align>
+            </wp:positionH>
+            <wp:positionV relativeFrom="paragraph">
+              <wp:posOffset>8543</wp:posOffset>
+            </wp:positionV>
+            <wp:extent cx="3923030" cy="799465"/>
+            <wp:effectExtent l="0" t="0" r="1270" b="635"/>
+            <wp:wrapThrough wrapText="bothSides">
+              <wp:wrapPolygon edited="0">
+                <wp:start x="0" y="0"/>
+                <wp:lineTo x="0" y="21102"/>
+                <wp:lineTo x="21502" y="21102"/>
+                <wp:lineTo x="21502" y="0"/>
+                <wp:lineTo x="0" y="0"/>
+              </wp:wrapPolygon>
+            </wp:wrapThrough>
+            <wp:docPr id="313705844" name="Afbeelding 1"/>
+            <wp:cNvGraphicFramePr>
+              <a:graphicFrameLocks xmlns:a="http://schemas.openxmlformats.org/drawingml/2006/main" noChangeAspect="1"/>
+            </wp:cNvGraphicFramePr>
+            <a:graphic xmlns:a="http://schemas.openxmlformats.org/drawingml/2006/main">
+              <a:graphicData uri="http://schemas.openxmlformats.org/drawingml/2006/picture">
+                <pic:pic xmlns:pic="http://schemas.openxmlformats.org/drawingml/2006/picture">
+                  <pic:nvPicPr>
+                    <pic:cNvPr id="313705844" name=""/>
+                    <pic:cNvPicPr/>
+                  </pic:nvPicPr>
+                  <pic:blipFill>
+                    <a:blip r:embed="rId6">
+                      <a:extLst>
+                        <a:ext uri="{28A0092B-C50C-407E-A947-70E740481C1C}">
+                          <a14:useLocalDpi xmlns:a14="http://schemas.microsoft.com/office/drawing/2010/main" val="0"/>
+                        </a:ext>
+                      </a:extLst>
+                    </a:blip>
+                    <a:stretch>
+                      <a:fillRect/>
+                    </a:stretch>
+                  </pic:blipFill>
+                  <pic:spPr>
+                    <a:xfrm>
+                      <a:off x="0" y="0"/>
+                      <a:ext cx="3923030" cy="799465"/>
+                    </a:xfrm>
+                    <a:prstGeom prst="rect">
+                      <a:avLst/>
+                    </a:prstGeom>
+                  </pic:spPr>
+                </pic:pic>
+              </a:graphicData>
+            </a:graphic>
+            <wp14:sizeRelH relativeFrom="margin">
+              <wp14:pctWidth>0</wp14:pctWidth>
+            </wp14:sizeRelH>
+            <wp14:sizeRelV relativeFrom="margin">
+              <wp14:pctHeight>0</wp14:pctHeight>
+            </wp14:sizeRelV>
+          </wp:anchor>
+        </w:drawing>
+      </w:r>
+      <w:r>
         <w:t>Status</w:t>
       </w:r>
     </w:p>
@@ -268,11 +278,9 @@
           <w:numId w:val="12"/>
         </w:numPr>
       </w:pPr>
-      <w:proofErr w:type="spellStart"/>
       <w:r>
         <w:t>Add</w:t>
       </w:r>
-      <w:proofErr w:type="spellEnd"/>
     </w:p>
     <w:p>
       <w:pPr>
@@ -282,13 +290,8 @@
           <w:numId w:val="12"/>
         </w:numPr>
       </w:pPr>
-      <w:proofErr w:type="spellStart"/>
       <w:r>
-        <w:t>Commit</w:t>
-      </w:r>
-      <w:proofErr w:type="spellEnd"/>
-      <w:r>
-        <w:t xml:space="preserve"> met tekst waarom. </w:t>
+        <w:t xml:space="preserve">Commit met tekst waarom. </w:t>
       </w:r>
     </w:p>
     <w:p>

</xml_diff>

<commit_message>
Added better poule system
</commit_message>
<xml_diff>
--- a/Docs/Project_LOG.docx
+++ b/Docs/Project_LOG.docx
@@ -6,8 +6,13 @@
       <w:pPr>
         <w:jc w:val="center"/>
       </w:pPr>
-      <w:r>
-        <w:t>Champions league model:</w:t>
+      <w:proofErr w:type="spellStart"/>
+      <w:r>
+        <w:t>Champions</w:t>
+      </w:r>
+      <w:proofErr w:type="spellEnd"/>
+      <w:r>
+        <w:t xml:space="preserve"> league model:</w:t>
       </w:r>
     </w:p>
     <w:p>
@@ -36,7 +41,23 @@
         </w:numPr>
       </w:pPr>
       <w:r>
-        <w:t>Maak functie die lambda berekent (evt onderscheid in thuis/uit)</w:t>
+        <w:t xml:space="preserve">Maak functie die </w:t>
+      </w:r>
+      <w:proofErr w:type="spellStart"/>
+      <w:r>
+        <w:t>lambda</w:t>
+      </w:r>
+      <w:proofErr w:type="spellEnd"/>
+      <w:r>
+        <w:t xml:space="preserve"> berekent (</w:t>
+      </w:r>
+      <w:proofErr w:type="spellStart"/>
+      <w:r>
+        <w:t>evt</w:t>
+      </w:r>
+      <w:proofErr w:type="spellEnd"/>
+      <w:r>
+        <w:t xml:space="preserve"> onderscheid in thuis/uit)</w:t>
       </w:r>
     </w:p>
     <w:p>
@@ -99,8 +120,13 @@
           <w:numId w:val="11"/>
         </w:numPr>
       </w:pPr>
-      <w:r>
-        <w:t>Chatgpt gebruikt voor importeren data naar python</w:t>
+      <w:proofErr w:type="spellStart"/>
+      <w:r>
+        <w:t>Chatgpt</w:t>
+      </w:r>
+      <w:proofErr w:type="spellEnd"/>
+      <w:r>
+        <w:t xml:space="preserve"> gebruikt voor importeren data naar python</w:t>
       </w:r>
       <w:r>
         <w:t>, en opschonen data.</w:t>
@@ -160,7 +186,15 @@
         <w:t>Data opschonen ging via</w:t>
       </w:r>
       <w:r>
-        <w:t xml:space="preserve"> informatie opvragen via code over allerlei rijen en kolommen. Bijv missing data etc. </w:t>
+        <w:t xml:space="preserve"> informatie opvragen via code over allerlei rijen en kolommen. </w:t>
+      </w:r>
+      <w:proofErr w:type="spellStart"/>
+      <w:r>
+        <w:t>Bijv</w:t>
+      </w:r>
+      <w:proofErr w:type="spellEnd"/>
+      <w:r>
+        <w:t xml:space="preserve"> missing data etc. </w:t>
       </w:r>
     </w:p>
     <w:p/>
@@ -177,8 +211,21 @@
           <w:numId w:val="11"/>
         </w:numPr>
       </w:pPr>
-      <w:r>
-        <w:t xml:space="preserve">Chatgpt gebruikt voor uploaden github. </w:t>
+      <w:proofErr w:type="spellStart"/>
+      <w:r>
+        <w:t>Chatgpt</w:t>
+      </w:r>
+      <w:proofErr w:type="spellEnd"/>
+      <w:r>
+        <w:t xml:space="preserve"> gebruikt voor uploaden </w:t>
+      </w:r>
+      <w:proofErr w:type="spellStart"/>
+      <w:r>
+        <w:t>github</w:t>
+      </w:r>
+      <w:proofErr w:type="spellEnd"/>
+      <w:r>
+        <w:t xml:space="preserve">. </w:t>
       </w:r>
     </w:p>
     <w:p>
@@ -190,7 +237,15 @@
         </w:numPr>
       </w:pPr>
       <w:r>
-        <w:t>Belangrijke volgorde voor changes op github:</w:t>
+        <w:t xml:space="preserve">Belangrijke volgorde voor changes op </w:t>
+      </w:r>
+      <w:proofErr w:type="spellStart"/>
+      <w:r>
+        <w:t>github</w:t>
+      </w:r>
+      <w:proofErr w:type="spellEnd"/>
+      <w:r>
+        <w:t>:</w:t>
       </w:r>
     </w:p>
     <w:p>
@@ -202,6 +257,9 @@
         </w:numPr>
       </w:pPr>
       <w:r>
+        <w:rPr>
+          <w:noProof/>
+        </w:rPr>
         <w:drawing>
           <wp:anchor distT="0" distB="0" distL="114300" distR="114300" simplePos="0" relativeHeight="251658240" behindDoc="0" locked="0" layoutInCell="1" allowOverlap="1" wp14:anchorId="61FED38F" wp14:editId="13B07129">
             <wp:simplePos x="0" y="0"/>
@@ -278,9 +336,11 @@
           <w:numId w:val="12"/>
         </w:numPr>
       </w:pPr>
+      <w:proofErr w:type="spellStart"/>
       <w:r>
         <w:t>Add</w:t>
       </w:r>
+      <w:proofErr w:type="spellEnd"/>
     </w:p>
     <w:p>
       <w:pPr>
@@ -290,8 +350,13 @@
           <w:numId w:val="12"/>
         </w:numPr>
       </w:pPr>
-      <w:r>
-        <w:t xml:space="preserve">Commit met tekst waarom. </w:t>
+      <w:proofErr w:type="spellStart"/>
+      <w:r>
+        <w:t>Commit</w:t>
+      </w:r>
+      <w:proofErr w:type="spellEnd"/>
+      <w:r>
+        <w:t xml:space="preserve"> met tekst waarom. </w:t>
       </w:r>
     </w:p>
     <w:p>
@@ -304,6 +369,56 @@
       </w:pPr>
       <w:r>
         <w:t>Push (uploaden)</w:t>
+      </w:r>
+    </w:p>
+    <w:p/>
+    <w:p>
+      <w:r>
+        <w:t>1</w:t>
+      </w:r>
+      <w:r>
+        <w:t>7-07:</w:t>
+      </w:r>
+    </w:p>
+    <w:p>
+      <w:pPr>
+        <w:pStyle w:val="Lijstalinea"/>
+        <w:numPr>
+          <w:ilvl w:val="0"/>
+          <w:numId w:val="11"/>
+        </w:numPr>
+      </w:pPr>
+      <w:r>
+        <w:t>Poule indeling gemaakt met verschillende functies.</w:t>
+      </w:r>
+    </w:p>
+    <w:p>
+      <w:pPr>
+        <w:pStyle w:val="Lijstalinea"/>
+        <w:numPr>
+          <w:ilvl w:val="0"/>
+          <w:numId w:val="11"/>
+        </w:numPr>
+      </w:pPr>
+      <w:proofErr w:type="spellStart"/>
+      <w:r>
+        <w:t>Chatgpt</w:t>
+      </w:r>
+      <w:proofErr w:type="spellEnd"/>
+      <w:r>
+        <w:t xml:space="preserve"> gebruikt als assistent en feedback</w:t>
+      </w:r>
+    </w:p>
+    <w:p>
+      <w:pPr>
+        <w:pStyle w:val="Lijstalinea"/>
+        <w:numPr>
+          <w:ilvl w:val="0"/>
+          <w:numId w:val="11"/>
+        </w:numPr>
+      </w:pPr>
+      <w:r>
+        <w:t xml:space="preserve">Probleem -&gt; Algoritme loopt soms vast, nu simpelste optie gebruikt dat die na 1000 keer opnieuw loot. Ander idee: Alle mogelijke wedstrijden laden, en dan pas kijken welke geldig zijn en random kiezen. </w:t>
       </w:r>
     </w:p>
     <w:sectPr>

</xml_diff>